<commit_message>
Docs: sync deliverables with 4 new features + Gmail SMTP fix
- Tổng quan đề tài (TONG-QUAN-DE-TAI.docx): correct email provider
  Resend -> Gmail SMTP (nodemailer); add appointment scheduling,
  automatic SIS/LMS integration, compound alerts, cohort report export
  to the feature list.
- Hướng dẫn sử dụng web: add section 7 (advisor appointments, student
  + advisor flow) and section 8 (SIS/LMS sync), note appointments.sql;
  refresh dashboard table + date.
- Tóm tắt cuộc chat: 4 new features, 351 i18n keys, 4 protected API
  endpoints (incl. admin/sync-lms), 4 required SQL files (incl.
  appointments.sql). Regenerated matching PDFs.

Co-Authored-By: Claude Opus 4.8 <noreply@anthropic.com>
</commit_message>
<xml_diff>
--- a/Project for Capstone 2/student_risk_system/Huong-dan-su-dung-web.docx
+++ b/Project for Capstone 2/student_risk_system/Huong-dan-su-dung-web.docx
@@ -62,7 +62,7 @@
         </w:rPr>
         <w:t xml:space="preserve">Địa chỉ:  </w:t>
       </w:r>
-      <w:hyperlink w:history="1" r:id="rIdwbi8obuyrv8dotmlojxtb">
+      <w:hyperlink w:history="1" r:id="rIdsvtz_qkj6jtyak0mg6h3l">
         <w:r>
           <w:rPr>
             <w:rFonts w:ascii="Calibri" w:cs="Calibri" w:eastAsia="Calibri" w:hAnsi="Calibri"/>
@@ -87,7 +87,7 @@
           <w:sz w:val="20"/>
           <w:szCs w:val="20"/>
         </w:rPr>
-        <w:t xml:space="preserve">Hệ thống Cảnh báo Rủi ro Học tập · 09/07/2026</w:t>
+        <w:t xml:space="preserve">Hệ thống Cảnh báo Rủi ro Học tập · 12/07/2026</w:t>
       </w:r>
     </w:p>
     <w:p>
@@ -1678,6 +1678,27 @@
       </w:r>
     </w:p>
     <w:p>
+      Đặt 
+      <w:r>
+        <w:rPr>
+          <w:rFonts w:ascii="Calibri" w:cs="Calibri" w:eastAsia="Calibri" w:hAnsi="Calibri"/>
+          <w:b/>
+          <w:bCs/>
+          <w:sz w:val="22"/>
+          <w:szCs w:val="22"/>
+        </w:rPr>
+        <w:t xml:space="preserve">lịch hẹn với cố vấn</w:t>
+      </w:r>
+      <w:r>
+        <w:rPr>
+          <w:rFonts w:ascii="Calibri" w:cs="Calibri" w:eastAsia="Calibri" w:hAnsi="Calibri"/>
+          <w:sz w:val="22"/>
+          <w:szCs w:val="22"/>
+        </w:rPr>
+        <w:t xml:space="preserve"> (xem mục 7).</w:t>
+      </w:r>
+    </w:p>
+    <w:p>
       <w:r>
         <w:br w:type="page"/>
       </w:r>
@@ -1881,7 +1902,7 @@
                 <w:sz w:val="20"/>
                 <w:szCs w:val="20"/>
               </w:rPr>
-              <w:t xml:space="preserve">Tìm/lọc, dự đoán vào vùng báo động; Thêm SV / Nhập CSV / Nhập điểm; chi tiết SV (nhập điểm, chỉ số, cảnh báo, can thiệp, chat)</w:t>
+              <w:t xml:space="preserve">Tìm/lọc, dự đoán vào vùng báo động; Thêm SV / Nhập CSV / Nhập điểm; Xuất báo cáo rủi ro theo lớp (CSV); chi tiết SV (nhập điểm, chỉ số, cảnh báo, can thiệp, chat, lịch hẹn)</w:t>
             </w:r>
           </w:p>
         </w:tc>
@@ -1991,7 +2012,7 @@
                 <w:sz w:val="20"/>
                 <w:szCs w:val="20"/>
               </w:rPr>
-              <w:t xml:space="preserve">Xử lý cảnh báo theo trạng thái, ghi nhận can thiệp, hỏi đáp SV</w:t>
+              <w:t xml:space="preserve">Xử lý cảnh báo theo trạng thái (kèm cảnh báo tổ hợp nhiều điều kiện), ghi nhận can thiệp, hỏi đáp SV</w:t>
             </w:r>
           </w:p>
         </w:tc>
@@ -2045,7 +2066,7 @@
                 <w:sz w:val="20"/>
                 <w:szCs w:val="20"/>
               </w:rPr>
-              <w:t xml:space="preserve">Precision/Recall/F1, hiệu quả can thiệp; Cấu hình rủi ro (Quản lý)</w:t>
+              <w:t xml:space="preserve">Precision/Recall/F1, hiệu quả can thiệp; Cấu hình rủi ro (Quản lý); Đồng bộ SIS/LMS</w:t>
             </w:r>
           </w:p>
         </w:tc>
@@ -2282,6 +2303,424 @@
       </w:r>
     </w:p>
     <w:p>
+      <w:r>
+        <w:br w:type="page"/>
+      </w:r>
+    </w:p>
+    <w:p>
+      <w:pPr>
+        <w:pStyle w:val="Heading1"/>
+        <w:spacing w:after="110" w:before="280"/>
+      </w:pPr>
+      <w:r>
+        <w:rPr>
+          <w:rFonts w:ascii="Calibri" w:cs="Calibri" w:eastAsia="Calibri" w:hAnsi="Calibri"/>
+          <w:b/>
+          <w:bCs/>
+          <w:color w:val="13294F"/>
+          <w:sz w:val="28"/>
+          <w:szCs w:val="28"/>
+        </w:rPr>
+        <w:t xml:space="preserve">7. Đặt lịch hẹn cố vấn</w:t>
+      </w:r>
+    </w:p>
+    <w:p>
+      <w:pPr>
+        <w:pStyle w:val="Heading2"/>
+        <w:spacing w:after="70" w:before="190"/>
+      </w:pPr>
+      <w:r>
+        <w:rPr>
+          <w:rFonts w:ascii="Calibri" w:cs="Calibri" w:eastAsia="Calibri" w:hAnsi="Calibri"/>
+          <w:b/>
+          <w:bCs/>
+          <w:color w:val="13294F"/>
+          <w:sz w:val="23"/>
+          <w:szCs w:val="23"/>
+        </w:rPr>
+        <w:t xml:space="preserve">7.1. Sinh viên đặt lịch</w:t>
+      </w:r>
+    </w:p>
+    <w:p>
+      Cổng Sinh viên → thẻ 
+      <w:r>
+        <w:rPr>
+          <w:rFonts w:ascii="Calibri" w:cs="Calibri" w:eastAsia="Calibri" w:hAnsi="Calibri"/>
+          <w:b/>
+          <w:bCs/>
+          <w:sz w:val="22"/>
+          <w:szCs w:val="22"/>
+        </w:rPr>
+        <w:t xml:space="preserve">“Lịch hẹn cố vấn”</w:t>
+      </w:r>
+      <w:r>
+        <w:rPr>
+          <w:rFonts w:ascii="Calibri" w:cs="Calibri" w:eastAsia="Calibri" w:hAnsi="Calibri"/>
+          <w:sz w:val="22"/>
+          <w:szCs w:val="22"/>
+        </w:rPr>
+        <w:t xml:space="preserve"> (chỉ hiện khi đã có cố vấn phụ trách).</w:t>
+      </w:r>
+    </w:p>
+    <w:p>
+      Chọn 
+      <w:r>
+        <w:rPr>
+          <w:rFonts w:ascii="Calibri" w:cs="Calibri" w:eastAsia="Calibri" w:hAnsi="Calibri"/>
+          <w:b/>
+          <w:bCs/>
+          <w:sz w:val="22"/>
+          <w:szCs w:val="22"/>
+        </w:rPr>
+        <w:t xml:space="preserve">Thời gian</w:t>
+      </w:r>
+      <w:r>
+        <w:rPr>
+          <w:rFonts w:ascii="Calibri" w:cs="Calibri" w:eastAsia="Calibri" w:hAnsi="Calibri"/>
+          <w:sz w:val="22"/>
+          <w:szCs w:val="22"/>
+        </w:rPr>
+        <w:t xml:space="preserve"> + </w:t>
+      </w:r>
+      <w:r>
+        <w:rPr>
+          <w:rFonts w:ascii="Calibri" w:cs="Calibri" w:eastAsia="Calibri" w:hAnsi="Calibri"/>
+          <w:b/>
+          <w:bCs/>
+          <w:sz w:val="22"/>
+          <w:szCs w:val="22"/>
+        </w:rPr>
+        <w:t xml:space="preserve">Ghi chú</w:t>
+      </w:r>
+      <w:r>
+        <w:rPr>
+          <w:rFonts w:ascii="Calibri" w:cs="Calibri" w:eastAsia="Calibri" w:hAnsi="Calibri"/>
+          <w:sz w:val="22"/>
+          <w:szCs w:val="22"/>
+        </w:rPr>
+        <w:t xml:space="preserve"> (nội dung muốn trao đổi) → “Đặt lịch hẹn”.</w:t>
+      </w:r>
+    </w:p>
+    <w:p>
+      Xem danh sách lịch sắp tới với trạng thái: 
+      <w:r>
+        <w:rPr>
+          <w:rFonts w:ascii="Calibri" w:cs="Calibri" w:eastAsia="Calibri" w:hAnsi="Calibri"/>
+          <w:b/>
+          <w:bCs/>
+          <w:sz w:val="22"/>
+          <w:szCs w:val="22"/>
+        </w:rPr>
+        <w:t xml:space="preserve">Chờ duyệt → Đã xác nhận → Đã gặp</w:t>
+      </w:r>
+      <w:r>
+        <w:rPr>
+          <w:rFonts w:ascii="Calibri" w:cs="Calibri" w:eastAsia="Calibri" w:hAnsi="Calibri"/>
+          <w:sz w:val="22"/>
+          <w:szCs w:val="22"/>
+        </w:rPr>
+        <w:t xml:space="preserve">; có thể “Hủy” khi chưa diễn ra.</w:t>
+      </w:r>
+    </w:p>
+    <w:p>
+      <w:pPr>
+        <w:pStyle w:val="Heading2"/>
+        <w:spacing w:after="70" w:before="190"/>
+      </w:pPr>
+      <w:r>
+        <w:rPr>
+          <w:rFonts w:ascii="Calibri" w:cs="Calibri" w:eastAsia="Calibri" w:hAnsi="Calibri"/>
+          <w:b/>
+          <w:bCs/>
+          <w:color w:val="13294F"/>
+          <w:sz w:val="23"/>
+          <w:szCs w:val="23"/>
+        </w:rPr>
+        <w:t xml:space="preserve">7.2. Cố vấn duyệt lịch</w:t>
+      </w:r>
+    </w:p>
+    <w:p>
+      Mở 
+      <w:r>
+        <w:rPr>
+          <w:rFonts w:ascii="Calibri" w:cs="Calibri" w:eastAsia="Calibri" w:hAnsi="Calibri"/>
+          <w:b/>
+          <w:bCs/>
+          <w:sz w:val="22"/>
+          <w:szCs w:val="22"/>
+        </w:rPr>
+        <w:t xml:space="preserve">chi tiết sinh viên</w:t>
+      </w:r>
+      <w:r>
+        <w:rPr>
+          <w:rFonts w:ascii="Calibri" w:cs="Calibri" w:eastAsia="Calibri" w:hAnsi="Calibri"/>
+          <w:sz w:val="22"/>
+          <w:szCs w:val="22"/>
+        </w:rPr>
+        <w:t xml:space="preserve"> → thẻ “Lịch hẹn cố vấn” → chọn </w:t>
+      </w:r>
+      <w:r>
+        <w:rPr>
+          <w:rFonts w:ascii="Calibri" w:cs="Calibri" w:eastAsia="Calibri" w:hAnsi="Calibri"/>
+          <w:b/>
+          <w:bCs/>
+          <w:sz w:val="22"/>
+          <w:szCs w:val="22"/>
+        </w:rPr>
+        <w:t xml:space="preserve">Xác nhận / Đã gặp / Hủy</w:t>
+      </w:r>
+      <w:r>
+        <w:rPr>
+          <w:rFonts w:ascii="Calibri" w:cs="Calibri" w:eastAsia="Calibri" w:hAnsi="Calibri"/>
+          <w:sz w:val="22"/>
+          <w:szCs w:val="22"/>
+        </w:rPr>
+        <w:t xml:space="preserve"> cho từng lịch. Trạng thái đồng bộ realtime hai chiều.</w:t>
+      </w:r>
+    </w:p>
+    <w:p>
+      <w:pPr>
+        <w:pBdr>
+          <w:left w:val="single" w:color="C9A227" w:sz="18"/>
+        </w:pBdr>
+        <w:shd w:fill="FBF3E2" w:val="clear"/>
+        <w:spacing w:after="120"/>
+        <w:ind w:left="120"/>
+      </w:pPr>
+      <w:r>
+        <w:rPr>
+          <w:rFonts w:ascii="Calibri" w:cs="Calibri" w:eastAsia="Calibri" w:hAnsi="Calibri"/>
+          <w:b/>
+          <w:bCs/>
+          <w:color w:val="7A5300"/>
+          <w:sz w:val="22"/>
+          <w:szCs w:val="22"/>
+        </w:rPr>
+        <w:t xml:space="preserve">Lưu ý: </w:t>
+      </w:r>
+      <w:r>
+        <w:rPr>
+          <w:rFonts w:ascii="Calibri" w:cs="Calibri" w:eastAsia="Calibri" w:hAnsi="Calibri"/>
+          <w:sz w:val="22"/>
+          <w:szCs w:val="22"/>
+        </w:rPr>
+        <w:t xml:space="preserve">Cần chạy </w:t>
+      </w:r>
+      <w:r>
+        <w:rPr>
+          <w:rFonts w:ascii="Calibri" w:cs="Calibri" w:eastAsia="Calibri" w:hAnsi="Calibri"/>
+          <w:b/>
+          <w:bCs/>
+          <w:sz w:val="22"/>
+          <w:szCs w:val="22"/>
+        </w:rPr>
+        <w:t xml:space="preserve">appointments.sql</w:t>
+      </w:r>
+      <w:r>
+        <w:rPr>
+          <w:rFonts w:ascii="Calibri" w:cs="Calibri" w:eastAsia="Calibri" w:hAnsi="Calibri"/>
+          <w:sz w:val="22"/>
+          <w:szCs w:val="22"/>
+        </w:rPr>
+        <w:t xml:space="preserve"> trong Supabase SQL Editor để bật bảng lịch hẹn (kèm RLS + realtime). Chưa chạy thì phần đặt lịch báo lỗi / để trống.</w:t>
+      </w:r>
+    </w:p>
+    <w:p>
+      <w:pPr>
+        <w:pStyle w:val="Heading1"/>
+        <w:spacing w:after="110" w:before="280"/>
+      </w:pPr>
+      <w:r>
+        <w:rPr>
+          <w:rFonts w:ascii="Calibri" w:cs="Calibri" w:eastAsia="Calibri" w:hAnsi="Calibri"/>
+          <w:b/>
+          <w:bCs/>
+          <w:color w:val="13294F"/>
+          <w:sz w:val="28"/>
+          <w:szCs w:val="28"/>
+        </w:rPr>
+        <w:t xml:space="preserve">8. Đồng bộ SIS/LMS (chuyên cần &amp; hoạt động LMS)</w:t>
+      </w:r>
+    </w:p>
+    <w:p>
+      <w:pPr>
+        <w:spacing w:after="110"/>
+      </w:pPr>
+      <w:r>
+        <w:rPr>
+          <w:rFonts w:ascii="Calibri" w:cs="Calibri" w:eastAsia="Calibri" w:hAnsi="Calibri"/>
+          <w:sz w:val="22"/>
+          <w:szCs w:val="22"/>
+        </w:rPr>
+        <w:t xml:space="preserve">Cập nhật tự động tỉ lệ chuyên cần và điểm hoạt động LMS từ nguồn xuất của trường, thay cho nhập tay từng sinh viên.</w:t>
+      </w:r>
+    </w:p>
+    <w:p>
+      Menu 
+      <w:r>
+        <w:rPr>
+          <w:rFonts w:ascii="Calibri" w:cs="Calibri" w:eastAsia="Calibri" w:hAnsi="Calibri"/>
+          <w:b/>
+          <w:bCs/>
+          <w:sz w:val="22"/>
+          <w:szCs w:val="22"/>
+        </w:rPr>
+        <w:t xml:space="preserve">“Đánh giá”</w:t>
+      </w:r>
+      <w:r>
+        <w:rPr>
+          <w:rFonts w:ascii="Calibri" w:cs="Calibri" w:eastAsia="Calibri" w:hAnsi="Calibri"/>
+          <w:sz w:val="22"/>
+          <w:szCs w:val="22"/>
+        </w:rPr>
+        <w:t xml:space="preserve"> → thẻ </w:t>
+      </w:r>
+      <w:r>
+        <w:rPr>
+          <w:rFonts w:ascii="Calibri" w:cs="Calibri" w:eastAsia="Calibri" w:hAnsi="Calibri"/>
+          <w:b/>
+          <w:bCs/>
+          <w:sz w:val="22"/>
+          <w:szCs w:val="22"/>
+        </w:rPr>
+        <w:t xml:space="preserve">“Đồng bộ SIS/LMS”</w:t>
+      </w:r>
+      <w:r>
+        <w:rPr>
+          <w:rFonts w:ascii="Calibri" w:cs="Calibri" w:eastAsia="Calibri" w:hAnsi="Calibri"/>
+          <w:sz w:val="22"/>
+          <w:szCs w:val="22"/>
+        </w:rPr>
+        <w:t xml:space="preserve">.</w:t>
+      </w:r>
+    </w:p>
+    <w:p>
+      <w:pPr>
+        <w:pStyle w:val="ListParagraph"/>
+        <w:numPr>
+          <w:ilvl w:val="0"/>
+          <w:numId w:val="6"/>
+        </w:numPr>
+        <w:spacing w:after="70"/>
+      </w:pPr>
+      <w:r>
+        <w:rPr>
+          <w:rFonts w:ascii="Calibri" w:cs="Calibri" w:eastAsia="Calibri" w:hAnsi="Calibri"/>
+          <w:b/>
+          <w:bCs/>
+          <w:sz w:val="22"/>
+          <w:szCs w:val="22"/>
+        </w:rPr>
+        <w:t xml:space="preserve">Cách 1 — theo liên kết: </w:t>
+      </w:r>
+      <w:r>
+        <w:rPr>
+          <w:rFonts w:ascii="Calibri" w:cs="Calibri" w:eastAsia="Calibri" w:hAnsi="Calibri"/>
+          <w:sz w:val="22"/>
+          <w:szCs w:val="22"/>
+        </w:rPr>
+        <w:t xml:space="preserve">dán liên kết CSV đã xuất bản (Google Sheet: Tệp → Chia sẻ → Xuất bản lên web → CSV) rồi “Kéo &amp; đồng bộ”.</w:t>
+      </w:r>
+    </w:p>
+    <w:p>
+      <w:pPr>
+        <w:pStyle w:val="ListParagraph"/>
+        <w:numPr>
+          <w:ilvl w:val="0"/>
+          <w:numId w:val="6"/>
+        </w:numPr>
+        <w:spacing w:after="70"/>
+      </w:pPr>
+      <w:r>
+        <w:rPr>
+          <w:rFonts w:ascii="Calibri" w:cs="Calibri" w:eastAsia="Calibri" w:hAnsi="Calibri"/>
+          <w:b/>
+          <w:bCs/>
+          <w:sz w:val="22"/>
+          <w:szCs w:val="22"/>
+        </w:rPr>
+        <w:t xml:space="preserve">Cách 2 — dán trực tiếp: </w:t>
+      </w:r>
+      <w:r>
+        <w:rPr>
+          <w:rFonts w:ascii="Calibri" w:cs="Calibri" w:eastAsia="Calibri" w:hAnsi="Calibri"/>
+          <w:sz w:val="22"/>
+          <w:szCs w:val="22"/>
+        </w:rPr>
+        <w:t xml:space="preserve">dán nội dung CSV vào ô rồi “Áp dụng CSV”.</w:t>
+      </w:r>
+    </w:p>
+    <w:p>
+      Hệ thống cập nhật chuyên cần + điểm LMS theo MSSV rồi 
+      <w:r>
+        <w:rPr>
+          <w:rFonts w:ascii="Calibri" w:cs="Calibri" w:eastAsia="Calibri" w:hAnsi="Calibri"/>
+          <w:b/>
+          <w:bCs/>
+          <w:sz w:val="22"/>
+          <w:szCs w:val="22"/>
+        </w:rPr>
+        <w:t xml:space="preserve">tự tính lại rủi ro</w:t>
+      </w:r>
+      <w:r>
+        <w:rPr>
+          <w:rFonts w:ascii="Calibri" w:cs="Calibri" w:eastAsia="Calibri" w:hAnsi="Calibri"/>
+          <w:sz w:val="22"/>
+          <w:szCs w:val="22"/>
+        </w:rPr>
+        <w:t xml:space="preserve">.</w:t>
+      </w:r>
+    </w:p>
+    <w:p>
+      Cột CSV cần có: 
+      <w:r>
+        <w:rPr>
+          <w:rFonts w:ascii="Calibri" w:cs="Calibri" w:eastAsia="Calibri" w:hAnsi="Calibri"/>
+          <w:b/>
+          <w:bCs/>
+          <w:sz w:val="22"/>
+          <w:szCs w:val="22"/>
+        </w:rPr>
+        <w:t xml:space="preserve">student_code, attendance_rate, lms_activity_score</w:t>
+      </w:r>
+      <w:r>
+        <w:rPr>
+          <w:rFonts w:ascii="Calibri" w:cs="Calibri" w:eastAsia="Calibri" w:hAnsi="Calibri"/>
+          <w:sz w:val="22"/>
+          <w:szCs w:val="22"/>
+        </w:rPr>
+        <w:t xml:space="preserve"> (chấp nhận cả mssv / attendance / lms).</w:t>
+      </w:r>
+    </w:p>
+    <w:p>
+      <w:pPr>
+        <w:pStyle w:val="ListParagraph"/>
+        <w:numPr>
+          <w:ilvl w:val="0"/>
+          <w:numId w:val="2"/>
+        </w:numPr>
+        <w:spacing w:after="60"/>
+      </w:pPr>
+      <w:r>
+        <w:rPr>
+          <w:rFonts w:ascii="Calibri" w:cs="Calibri" w:eastAsia="Calibri" w:hAnsi="Calibri"/>
+          <w:b/>
+          <w:bCs/>
+          <w:sz w:val="22"/>
+          <w:szCs w:val="22"/>
+        </w:rPr>
+        <w:t xml:space="preserve">Phân quyền: </w:t>
+      </w:r>
+      <w:r>
+        <w:rPr>
+          <w:rFonts w:ascii="Calibri" w:cs="Calibri" w:eastAsia="Calibri" w:hAnsi="Calibri"/>
+          <w:sz w:val="22"/>
+          <w:szCs w:val="22"/>
+        </w:rPr>
+        <w:t xml:space="preserve">cố vấn chỉ đồng bộ sinh viên mình phụ trách; Quản lý đồng bộ tất cả.</w:t>
+      </w:r>
+    </w:p>
+    <w:p>
       <w:pPr>
         <w:pBdr>
           <w:left w:val="single" w:color="157F3C" w:sz="18"/>
@@ -2307,7 +2746,54 @@
           <w:sz w:val="22"/>
           <w:szCs w:val="22"/>
         </w:rPr>
-        <w:t xml:space="preserve">Để tính năng Cấu hình &amp; Khóa điểm hoạt động, chạy </w:t>
+        <w:t xml:space="preserve">Cần đặt </w:t>
+      </w:r>
+      <w:r>
+        <w:rPr>
+          <w:rFonts w:ascii="Calibri" w:cs="Calibri" w:eastAsia="Calibri" w:hAnsi="Calibri"/>
+          <w:b/>
+          <w:bCs/>
+          <w:sz w:val="22"/>
+          <w:szCs w:val="22"/>
+        </w:rPr>
+        <w:t xml:space="preserve">SUPABASE_SERVICE_ROLE_KEY</w:t>
+      </w:r>
+      <w:r>
+        <w:rPr>
+          <w:rFonts w:ascii="Calibri" w:cs="Calibri" w:eastAsia="Calibri" w:hAnsi="Calibri"/>
+          <w:sz w:val="22"/>
+          <w:szCs w:val="22"/>
+        </w:rPr>
+        <w:t xml:space="preserve"> trên Vercel (Environment Variables) để endpoint đồng bộ hoạt động.</w:t>
+      </w:r>
+    </w:p>
+    <w:p>
+      <w:pPr>
+        <w:pBdr>
+          <w:left w:val="single" w:color="157F3C" w:sz="18"/>
+        </w:pBdr>
+        <w:shd w:fill="EAF5EE" w:val="clear"/>
+        <w:spacing w:after="120"/>
+        <w:ind w:left="120"/>
+      </w:pPr>
+      <w:r>
+        <w:rPr>
+          <w:rFonts w:ascii="Calibri" w:cs="Calibri" w:eastAsia="Calibri" w:hAnsi="Calibri"/>
+          <w:b/>
+          <w:bCs/>
+          <w:color w:val="135F32"/>
+          <w:sz w:val="22"/>
+          <w:szCs w:val="22"/>
+        </w:rPr>
+        <w:t xml:space="preserve">Cần cấu hình: </w:t>
+      </w:r>
+      <w:r>
+        <w:rPr>
+          <w:rFonts w:ascii="Calibri" w:cs="Calibri" w:eastAsia="Calibri" w:hAnsi="Calibri"/>
+          <w:sz w:val="22"/>
+          <w:szCs w:val="22"/>
+        </w:rPr>
+        <w:t xml:space="preserve">Tổng hợp SQL cần chạy trong Supabase SQL Editor: </w:t>
       </w:r>
       <w:r>
         <w:rPr>
@@ -2325,7 +2811,7 @@
           <w:sz w:val="22"/>
           <w:szCs w:val="22"/>
         </w:rPr>
-        <w:t xml:space="preserve"> và </w:t>
+        <w:t xml:space="preserve">, </w:t>
       </w:r>
       <w:r>
         <w:rPr>
@@ -2343,7 +2829,43 @@
           <w:sz w:val="22"/>
           <w:szCs w:val="22"/>
         </w:rPr>
-        <w:t xml:space="preserve"> trong Supabase SQL Editor. Email cần đặt GMAIL_USER/GMAIL_APP_PASSWORD trên Vercel.</w:t>
+        <w:t xml:space="preserve">, </w:t>
+      </w:r>
+      <w:r>
+        <w:rPr>
+          <w:rFonts w:ascii="Calibri" w:cs="Calibri" w:eastAsia="Calibri" w:hAnsi="Calibri"/>
+          <w:b/>
+          <w:bCs/>
+          <w:sz w:val="22"/>
+          <w:szCs w:val="22"/>
+        </w:rPr>
+        <w:t xml:space="preserve">appointments.sql</w:t>
+      </w:r>
+      <w:r>
+        <w:rPr>
+          <w:rFonts w:ascii="Calibri" w:cs="Calibri" w:eastAsia="Calibri" w:hAnsi="Calibri"/>
+          <w:sz w:val="22"/>
+          <w:szCs w:val="22"/>
+        </w:rPr>
+        <w:t xml:space="preserve">; khuyến nghị </w:t>
+      </w:r>
+      <w:r>
+        <w:rPr>
+          <w:rFonts w:ascii="Calibri" w:cs="Calibri" w:eastAsia="Calibri" w:hAnsi="Calibri"/>
+          <w:b/>
+          <w:bCs/>
+          <w:sz w:val="22"/>
+          <w:szCs w:val="22"/>
+        </w:rPr>
+        <w:t xml:space="preserve">rls-major-scope.sql</w:t>
+      </w:r>
+      <w:r>
+        <w:rPr>
+          <w:rFonts w:ascii="Calibri" w:cs="Calibri" w:eastAsia="Calibri" w:hAnsi="Calibri"/>
+          <w:sz w:val="22"/>
+          <w:szCs w:val="22"/>
+        </w:rPr>
+        <w:t xml:space="preserve">. Email cần GMAIL_USER/GMAIL_APP_PASSWORD trên Vercel.</w:t>
       </w:r>
     </w:p>
     <w:p>
@@ -2578,6 +3100,18 @@
     </w:lvlOverride>
   </w:num>
   <w:num w:numId="4">
+    <w:abstractNumId w:val="3"/>
+    <w:lvlOverride w:ilvl="0">
+      <w:startOverride w:val="1"/>
+    </w:lvlOverride>
+  </w:num>
+  <w:num w:numId="5">
+    <w:abstractNumId w:val="3"/>
+    <w:lvlOverride w:ilvl="0">
+      <w:startOverride w:val="1"/>
+    </w:lvlOverride>
+  </w:num>
+  <w:num w:numId="6">
     <w:abstractNumId w:val="3"/>
     <w:lvlOverride w:ilvl="0">
       <w:startOverride w:val="1"/>

</xml_diff>

<commit_message>
Docs: refresh deliverables to final state
- Tóm tắt: cohort/major/course filters, two redrawn wireframes (system
  8 screens + student flow 9 screens), grading-scope decision (gradebook
  = teacher grade entry, whole-class via Manager), i18n 354 keys, all 4
  Supabase SQL migrations verified run (REST-checked 12/07); remaining
  ops item is only disabling public sign-ups + demo password note.
- Hướng dẫn sử dụng: student-list filters + clear-filters, grade-entry
  permission note (advisor scope vs Manager), SQL notes now say
  "already run on this deployment; rerun on fresh installs".
- Tổng quan đề tài: add student-list filtering to the feature list.
Regenerated both PDFs.

Co-Authored-By: Claude Fable 5 <noreply@anthropic.com>
</commit_message>
<xml_diff>
--- a/Project for Capstone 2/student_risk_system/Huong-dan-su-dung-web.docx
+++ b/Project for Capstone 2/student_risk_system/Huong-dan-su-dung-web.docx
@@ -62,7 +62,7 @@
         </w:rPr>
         <w:t xml:space="preserve">Địa chỉ:  </w:t>
       </w:r>
-      <w:hyperlink w:history="1" r:id="rIdsvtz_qkj6jtyak0mg6h3l">
+      <w:hyperlink w:history="1" r:id="rIdydxlli-gvi5cgfqi1psh0">
         <w:r>
           <w:rPr>
             <w:rFonts w:ascii="Calibri" w:cs="Calibri" w:eastAsia="Calibri" w:hAnsi="Calibri"/>
@@ -1902,7 +1902,7 @@
                 <w:sz w:val="20"/>
                 <w:szCs w:val="20"/>
               </w:rPr>
-              <w:t xml:space="preserve">Tìm/lọc, dự đoán vào vùng báo động; Thêm SV / Nhập CSV / Nhập điểm; Xuất báo cáo rủi ro theo lớp (CSV); chi tiết SV (nhập điểm, chỉ số, cảnh báo, can thiệp, chat, lịch hẹn)</w:t>
+              <w:t xml:space="preserve">Tìm kiếm; lọc theo Khóa / Ngành / Môn học + mức rủi ro (nút Xóa lọc); dự đoán vào vùng báo động; Thêm SV / Nhập CSV / Nhập điểm; Xuất báo cáo rủi ro (CSV); chi tiết SV (nhập điểm, chỉ số, cảnh báo, can thiệp, chat, lịch hẹn)</w:t>
             </w:r>
           </w:p>
         </w:tc>
@@ -2128,6 +2128,63 @@
       </w:r>
     </w:p>
     <w:p>“Xuất Excel”: tải bảng điểm ra CSV → sửa offline → “Nhập điểm”. “Khóa điểm”: chốt, không sửa được.</w:p>
+    <w:p>
+      <w:pPr>
+        <w:pBdr>
+          <w:left w:val="single" w:color="C9A227" w:sz="18"/>
+        </w:pBdr>
+        <w:shd w:fill="FBF3E2" w:val="clear"/>
+        <w:spacing w:after="120"/>
+        <w:ind w:left="120"/>
+      </w:pPr>
+      <w:r>
+        <w:rPr>
+          <w:rFonts w:ascii="Calibri" w:cs="Calibri" w:eastAsia="Calibri" w:hAnsi="Calibri"/>
+          <w:b/>
+          <w:bCs/>
+          <w:color w:val="7A5300"/>
+          <w:sz w:val="22"/>
+          <w:szCs w:val="22"/>
+        </w:rPr>
+        <w:t xml:space="preserve">Lưu ý: </w:t>
+      </w:r>
+      <w:r>
+        <w:rPr>
+          <w:rFonts w:ascii="Calibri" w:cs="Calibri" w:eastAsia="Calibri" w:hAnsi="Calibri"/>
+          <w:b/>
+          <w:bCs/>
+          <w:sz w:val="22"/>
+          <w:szCs w:val="22"/>
+        </w:rPr>
+        <w:t xml:space="preserve">Phân quyền nhập điểm: </w:t>
+      </w:r>
+      <w:r>
+        <w:rPr>
+          <w:rFonts w:ascii="Calibri" w:cs="Calibri" w:eastAsia="Calibri" w:hAnsi="Calibri"/>
+          <w:sz w:val="22"/>
+          <w:szCs w:val="22"/>
+        </w:rPr>
+        <w:t xml:space="preserve">cố vấn chỉ lưu được điểm của sinh viên mình phụ trách. Lớp học phần trộn nhiều ngành/khóa → nhập cả lớp bằng tài khoản </w:t>
+      </w:r>
+      <w:r>
+        <w:rPr>
+          <w:rFonts w:ascii="Calibri" w:cs="Calibri" w:eastAsia="Calibri" w:hAnsi="Calibri"/>
+          <w:b/>
+          <w:bCs/>
+          <w:sz w:val="22"/>
+          <w:szCs w:val="22"/>
+        </w:rPr>
+        <w:t xml:space="preserve">Quản lý</w:t>
+      </w:r>
+      <w:r>
+        <w:rPr>
+          <w:rFonts w:ascii="Calibri" w:cs="Calibri" w:eastAsia="Calibri" w:hAnsi="Calibri"/>
+          <w:sz w:val="22"/>
+          <w:szCs w:val="22"/>
+        </w:rPr>
+        <w:t xml:space="preserve">, hoặc nạp từ hệ thống trường qua Nhập CSV / Đồng bộ SIS-LMS.</w:t>
+      </w:r>
+    </w:p>
     <w:p>
       <w:pPr>
         <w:pStyle w:val="Heading2"/>
@@ -2504,7 +2561,7 @@
           <w:sz w:val="22"/>
           <w:szCs w:val="22"/>
         </w:rPr>
-        <w:t xml:space="preserve">Cần chạy </w:t>
+        <w:t xml:space="preserve">Bảng lịch hẹn do </w:t>
       </w:r>
       <w:r>
         <w:rPr>
@@ -2522,7 +2579,7 @@
           <w:sz w:val="22"/>
           <w:szCs w:val="22"/>
         </w:rPr>
-        <w:t xml:space="preserve"> trong Supabase SQL Editor để bật bảng lịch hẹn (kèm RLS + realtime). Chưa chạy thì phần đặt lịch báo lỗi / để trống.</w:t>
+        <w:t xml:space="preserve"> tạo (kèm RLS + realtime) — hệ thống hiện tại ĐÃ chạy; khi triển khai bản mới cần chạy lại trong Supabase SQL Editor.</w:t>
       </w:r>
     </w:p>
     <w:p>
@@ -2785,87 +2842,33 @@
           <w:sz w:val="22"/>
           <w:szCs w:val="22"/>
         </w:rPr>
-        <w:t xml:space="preserve">Cần cấu hình: </w:t>
-      </w:r>
-      <w:r>
-        <w:rPr>
-          <w:rFonts w:ascii="Calibri" w:cs="Calibri" w:eastAsia="Calibri" w:hAnsi="Calibri"/>
-          <w:sz w:val="22"/>
-          <w:szCs w:val="22"/>
-        </w:rPr>
-        <w:t xml:space="preserve">Tổng hợp SQL cần chạy trong Supabase SQL Editor: </w:t>
-      </w:r>
-      <w:r>
-        <w:rPr>
-          <w:rFonts w:ascii="Calibri" w:cs="Calibri" w:eastAsia="Calibri" w:hAnsi="Calibri"/>
-          <w:b/>
-          <w:bCs/>
-          <w:sz w:val="22"/>
-          <w:szCs w:val="22"/>
-        </w:rPr>
-        <w:t xml:space="preserve">risk-config.sql</w:t>
-      </w:r>
-      <w:r>
-        <w:rPr>
-          <w:rFonts w:ascii="Calibri" w:cs="Calibri" w:eastAsia="Calibri" w:hAnsi="Calibri"/>
-          <w:sz w:val="22"/>
-          <w:szCs w:val="22"/>
-        </w:rPr>
-        <w:t xml:space="preserve">, </w:t>
-      </w:r>
-      <w:r>
-        <w:rPr>
-          <w:rFonts w:ascii="Calibri" w:cs="Calibri" w:eastAsia="Calibri" w:hAnsi="Calibri"/>
-          <w:b/>
-          <w:bCs/>
-          <w:sz w:val="22"/>
-          <w:szCs w:val="22"/>
-        </w:rPr>
-        <w:t xml:space="preserve">grade-lock.sql</w:t>
-      </w:r>
-      <w:r>
-        <w:rPr>
-          <w:rFonts w:ascii="Calibri" w:cs="Calibri" w:eastAsia="Calibri" w:hAnsi="Calibri"/>
-          <w:sz w:val="22"/>
-          <w:szCs w:val="22"/>
-        </w:rPr>
-        <w:t xml:space="preserve">, </w:t>
-      </w:r>
-      <w:r>
-        <w:rPr>
-          <w:rFonts w:ascii="Calibri" w:cs="Calibri" w:eastAsia="Calibri" w:hAnsi="Calibri"/>
-          <w:b/>
-          <w:bCs/>
-          <w:sz w:val="22"/>
-          <w:szCs w:val="22"/>
-        </w:rPr>
-        <w:t xml:space="preserve">appointments.sql</w:t>
-      </w:r>
-      <w:r>
-        <w:rPr>
-          <w:rFonts w:ascii="Calibri" w:cs="Calibri" w:eastAsia="Calibri" w:hAnsi="Calibri"/>
-          <w:sz w:val="22"/>
-          <w:szCs w:val="22"/>
-        </w:rPr>
-        <w:t xml:space="preserve">; khuyến nghị </w:t>
-      </w:r>
-      <w:r>
-        <w:rPr>
-          <w:rFonts w:ascii="Calibri" w:cs="Calibri" w:eastAsia="Calibri" w:hAnsi="Calibri"/>
-          <w:b/>
-          <w:bCs/>
-          <w:sz w:val="22"/>
-          <w:szCs w:val="22"/>
-        </w:rPr>
-        <w:t xml:space="preserve">rls-major-scope.sql</w:t>
-      </w:r>
-      <w:r>
-        <w:rPr>
-          <w:rFonts w:ascii="Calibri" w:cs="Calibri" w:eastAsia="Calibri" w:hAnsi="Calibri"/>
-          <w:sz w:val="22"/>
-          <w:szCs w:val="22"/>
-        </w:rPr>
-        <w:t xml:space="preserve">. Email cần GMAIL_USER/GMAIL_APP_PASSWORD trên Vercel.</w:t>
+        <w:t xml:space="preserve">Cấu hình: </w:t>
+      </w:r>
+      <w:r>
+        <w:rPr>
+          <w:rFonts w:ascii="Calibri" w:cs="Calibri" w:eastAsia="Calibri" w:hAnsi="Calibri"/>
+          <w:sz w:val="22"/>
+          <w:szCs w:val="22"/>
+        </w:rPr>
+        <w:t xml:space="preserve">Hệ thống hiện tại ĐÃ chạy đủ các file SQL (</w:t>
+      </w:r>
+      <w:r>
+        <w:rPr>
+          <w:rFonts w:ascii="Calibri" w:cs="Calibri" w:eastAsia="Calibri" w:hAnsi="Calibri"/>
+          <w:b/>
+          <w:bCs/>
+          <w:sz w:val="22"/>
+          <w:szCs w:val="22"/>
+        </w:rPr>
+        <w:t xml:space="preserve">risk-config, grade-lock, appointments, rls-major-scope</w:t>
+      </w:r>
+      <w:r>
+        <w:rPr>
+          <w:rFonts w:ascii="Calibri" w:cs="Calibri" w:eastAsia="Calibri" w:hAnsi="Calibri"/>
+          <w:sz w:val="22"/>
+          <w:szCs w:val="22"/>
+        </w:rPr>
+        <w:t xml:space="preserve">) — khi triển khai bản mới thì chạy lại trong Supabase SQL Editor. Email cần GMAIL_USER/GMAIL_APP_PASSWORD trên Vercel; khuyến nghị tắt “Allow new users to sign up” trong Supabase Authentication.</w:t>
       </w:r>
     </w:p>
     <w:p>

</xml_diff>

<commit_message>
Docs: drop colored note frames; make wireframes plainer
- Guide + summary (docx/pdf): the orange/green framed "Lưu ý / Cấu
  hình" callout boxes are now plain paragraphs with a bold label —
  same text, no colored frame. Navy table headers unchanged.
- Both wireframes: removed emoji/glyph decorations, the swatch legend,
  numbered-circle caption bars (now plain "1. Title" headings), screen
  descriptions, flow strips and footer; flattened style (no shadows,
  square corners, white background) for a plainer hand-drawn look.
  Regenerated all four PDFs.

Co-Authored-By: Claude Fable 5 <noreply@anthropic.com>
</commit_message>
<xml_diff>
--- a/Project for Capstone 2/student_risk_system/Huong-dan-su-dung-web.docx
+++ b/Project for Capstone 2/student_risk_system/Huong-dan-su-dung-web.docx
@@ -62,7 +62,7 @@
         </w:rPr>
         <w:t xml:space="preserve">Địa chỉ:  </w:t>
       </w:r>
-      <w:hyperlink w:history="1" r:id="rIdydxlli-gvi5cgfqi1psh0">
+      <w:hyperlink w:history="1" r:id="rIdih3-woke5_hdwqgjxtfmh">
         <w:r>
           <w:rPr>
             <w:rFonts w:ascii="Calibri" w:cs="Calibri" w:eastAsia="Calibri" w:hAnsi="Calibri"/>
@@ -1416,19 +1416,13 @@
     </w:p>
     <w:p>
       <w:pPr>
-        <w:pBdr>
-          <w:left w:val="single" w:color="C9A227" w:sz="18"/>
-        </w:pBdr>
-        <w:shd w:fill="FBF3E2" w:val="clear"/>
         <w:spacing w:after="120"/>
-        <w:ind w:left="120"/>
-      </w:pPr>
-      <w:r>
-        <w:rPr>
-          <w:rFonts w:ascii="Calibri" w:cs="Calibri" w:eastAsia="Calibri" w:hAnsi="Calibri"/>
-          <w:b/>
-          <w:bCs/>
-          <w:color w:val="7A5300"/>
+      </w:pPr>
+      <w:r>
+        <w:rPr>
+          <w:rFonts w:ascii="Calibri" w:cs="Calibri" w:eastAsia="Calibri" w:hAnsi="Calibri"/>
+          <w:b/>
+          <w:bCs/>
           <w:sz w:val="22"/>
           <w:szCs w:val="22"/>
         </w:rPr>
@@ -2130,19 +2124,13 @@
     <w:p>“Xuất Excel”: tải bảng điểm ra CSV → sửa offline → “Nhập điểm”. “Khóa điểm”: chốt, không sửa được.</w:p>
     <w:p>
       <w:pPr>
-        <w:pBdr>
-          <w:left w:val="single" w:color="C9A227" w:sz="18"/>
-        </w:pBdr>
-        <w:shd w:fill="FBF3E2" w:val="clear"/>
         <w:spacing w:after="120"/>
-        <w:ind w:left="120"/>
-      </w:pPr>
-      <w:r>
-        <w:rPr>
-          <w:rFonts w:ascii="Calibri" w:cs="Calibri" w:eastAsia="Calibri" w:hAnsi="Calibri"/>
-          <w:b/>
-          <w:bCs/>
-          <w:color w:val="7A5300"/>
+      </w:pPr>
+      <w:r>
+        <w:rPr>
+          <w:rFonts w:ascii="Calibri" w:cs="Calibri" w:eastAsia="Calibri" w:hAnsi="Calibri"/>
+          <w:b/>
+          <w:bCs/>
           <w:sz w:val="22"/>
           <w:szCs w:val="22"/>
         </w:rPr>
@@ -2537,19 +2525,13 @@
     </w:p>
     <w:p>
       <w:pPr>
-        <w:pBdr>
-          <w:left w:val="single" w:color="C9A227" w:sz="18"/>
-        </w:pBdr>
-        <w:shd w:fill="FBF3E2" w:val="clear"/>
         <w:spacing w:after="120"/>
-        <w:ind w:left="120"/>
-      </w:pPr>
-      <w:r>
-        <w:rPr>
-          <w:rFonts w:ascii="Calibri" w:cs="Calibri" w:eastAsia="Calibri" w:hAnsi="Calibri"/>
-          <w:b/>
-          <w:bCs/>
-          <w:color w:val="7A5300"/>
+      </w:pPr>
+      <w:r>
+        <w:rPr>
+          <w:rFonts w:ascii="Calibri" w:cs="Calibri" w:eastAsia="Calibri" w:hAnsi="Calibri"/>
+          <w:b/>
+          <w:bCs/>
           <w:sz w:val="22"/>
           <w:szCs w:val="22"/>
         </w:rPr>
@@ -2779,19 +2761,13 @@
     </w:p>
     <w:p>
       <w:pPr>
-        <w:pBdr>
-          <w:left w:val="single" w:color="157F3C" w:sz="18"/>
-        </w:pBdr>
-        <w:shd w:fill="EAF5EE" w:val="clear"/>
         <w:spacing w:after="120"/>
-        <w:ind w:left="120"/>
-      </w:pPr>
-      <w:r>
-        <w:rPr>
-          <w:rFonts w:ascii="Calibri" w:cs="Calibri" w:eastAsia="Calibri" w:hAnsi="Calibri"/>
-          <w:b/>
-          <w:bCs/>
-          <w:color w:val="135F32"/>
+      </w:pPr>
+      <w:r>
+        <w:rPr>
+          <w:rFonts w:ascii="Calibri" w:cs="Calibri" w:eastAsia="Calibri" w:hAnsi="Calibri"/>
+          <w:b/>
+          <w:bCs/>
           <w:sz w:val="22"/>
           <w:szCs w:val="22"/>
         </w:rPr>
@@ -2826,19 +2802,13 @@
     </w:p>
     <w:p>
       <w:pPr>
-        <w:pBdr>
-          <w:left w:val="single" w:color="157F3C" w:sz="18"/>
-        </w:pBdr>
-        <w:shd w:fill="EAF5EE" w:val="clear"/>
         <w:spacing w:after="120"/>
-        <w:ind w:left="120"/>
-      </w:pPr>
-      <w:r>
-        <w:rPr>
-          <w:rFonts w:ascii="Calibri" w:cs="Calibri" w:eastAsia="Calibri" w:hAnsi="Calibri"/>
-          <w:b/>
-          <w:bCs/>
-          <w:color w:val="135F32"/>
+      </w:pPr>
+      <w:r>
+        <w:rPr>
+          <w:rFonts w:ascii="Calibri" w:cs="Calibri" w:eastAsia="Calibri" w:hAnsi="Calibri"/>
+          <w:b/>
+          <w:bCs/>
           <w:sz w:val="22"/>
           <w:szCs w:val="22"/>
         </w:rPr>

</xml_diff>

<commit_message>
Docs: sync wireframes + guides with the simplified advisor UI
Wireframes: 5-item nav (Alerts & Interventions merged, Gradebook screen
removed → system wireframe is 7 screens), student-list filters are now
Cohort + Semester, transcript blocks end with the SIS-style cumulative
lines (10-point, 4-point, credits). Regenerated PDFs and PNGs.
Guides: dashboard menu table updated, grade entry is now 2 methods
(Excel import + per-semester manual entry), permission note simplified;
summary logs the 13/07 streamlining round.

Co-Authored-By: Claude Fable 5 <noreply@anthropic.com>
</commit_message>
<xml_diff>
--- a/Project for Capstone 2/student_risk_system/Huong-dan-su-dung-web.docx
+++ b/Project for Capstone 2/student_risk_system/Huong-dan-su-dung-web.docx
@@ -62,7 +62,7 @@
         </w:rPr>
         <w:t xml:space="preserve">Địa chỉ:  </w:t>
       </w:r>
-      <w:hyperlink w:history="1" r:id="rIdih3-woke5_hdwqgjxtfmh">
+      <w:hyperlink w:history="1" r:id="rId050rqvnsqbkylkak4gykl">
         <w:r>
           <w:rPr>
             <w:rFonts w:ascii="Calibri" w:cs="Calibri" w:eastAsia="Calibri" w:hAnsi="Calibri"/>
@@ -1632,7 +1632,7 @@
           <w:sz w:val="22"/>
           <w:szCs w:val="22"/>
         </w:rPr>
-        <w:t xml:space="preserve">Bảng điểm theo học kỳ (chỉ xem) · nút “In bảng điểm”.</w:t>
+        <w:t xml:space="preserve">Bảng điểm theo học kỳ (chỉ xem) + điểm TB tích lũy hệ 10 / hệ 4, tổng tín chỉ · nút “In bảng điểm”.</w:t>
       </w:r>
     </w:p>
     <w:p>
@@ -1896,7 +1896,7 @@
                 <w:sz w:val="20"/>
                 <w:szCs w:val="20"/>
               </w:rPr>
-              <w:t xml:space="preserve">Tìm kiếm; lọc theo Khóa / Ngành / Môn học + mức rủi ro (nút Xóa lọc); dự đoán vào vùng báo động; Thêm SV / Nhập CSV / Nhập điểm; Xuất báo cáo rủi ro (CSV); chi tiết SV (nhập điểm, chỉ số, cảnh báo, can thiệp, chat, lịch hẹn)</w:t>
+              <w:t xml:space="preserve">Tìm kiếm; lọc theo Khóa / Học kỳ + mức rủi ro (nút Xóa lọc); dự đoán vào vùng báo động; Thêm SV / Nhập CSV / Nhập điểm; Xuất báo cáo rủi ro (CSV); chi tiết SV (bảng điểm theo kỳ + điểm TB tích lũy, cảnh báo, can thiệp, chat, lịch hẹn)</w:t>
             </w:r>
           </w:p>
         </w:tc>
@@ -1924,7 +1924,7 @@
                 <w:sz w:val="20"/>
                 <w:szCs w:val="20"/>
               </w:rPr>
-              <w:t xml:space="preserve">Bảng điểm</w:t>
+              <w:t xml:space="preserve">Cảnh báo &amp; Can thiệp</w:t>
             </w:r>
           </w:p>
         </w:tc>
@@ -1950,7 +1950,7 @@
                 <w:sz w:val="20"/>
                 <w:szCs w:val="20"/>
               </w:rPr>
-              <w:t xml:space="preserve">Nhập điểm cả lớp theo môn; Xuất Excel; Khóa/Mở khóa điểm</w:t>
+              <w:t xml:space="preserve">Một trang chung: xử lý cảnh báo theo trạng thái (kèm cảnh báo tổ hợp nhiều điều kiện) + nhật ký can thiệp phía dưới</w:t>
             </w:r>
           </w:p>
         </w:tc>
@@ -1979,7 +1979,7 @@
                 <w:sz w:val="20"/>
                 <w:szCs w:val="20"/>
               </w:rPr>
-              <w:t xml:space="preserve">Cảnh báo · Can thiệp · Tin nhắn</w:t>
+              <w:t xml:space="preserve">Tin nhắn</w:t>
             </w:r>
           </w:p>
         </w:tc>
@@ -2006,7 +2006,7 @@
                 <w:sz w:val="20"/>
                 <w:szCs w:val="20"/>
               </w:rPr>
-              <w:t xml:space="preserve">Xử lý cảnh báo theo trạng thái (kèm cảnh báo tổ hợp nhiều điều kiện), ghi nhận can thiệp, hỏi đáp SV</w:t>
+              <w:t xml:space="preserve">Hỏi đáp trực tiếp với sinh viên (realtime)</w:t>
             </w:r>
           </w:p>
         </w:tc>
@@ -2080,7 +2080,7 @@
           <w:sz w:val="28"/>
           <w:szCs w:val="28"/>
         </w:rPr>
-        <w:t xml:space="preserve">5. Nhập điểm (3 cách)</w:t>
+        <w:t xml:space="preserve">5. Nhập điểm (2 cách)</w:t>
       </w:r>
     </w:p>
     <w:p>
@@ -2097,80 +2097,28 @@
           <w:sz w:val="23"/>
           <w:szCs w:val="23"/>
         </w:rPr>
-        <w:t xml:space="preserve">5.1. Bảng điểm theo môn (khuyến nghị)</w:t>
-      </w:r>
-    </w:p>
-    <w:p>
-      Menu “Bảng điểm” → chọn môn (mã · học kỳ) → gõ TX/GK/CK cả lớp trên lưới → 
-      <w:r>
-        <w:rPr>
-          <w:rFonts w:ascii="Calibri" w:cs="Calibri" w:eastAsia="Calibri" w:hAnsi="Calibri"/>
-          <w:b/>
-          <w:bCs/>
-          <w:sz w:val="22"/>
-          <w:szCs w:val="22"/>
-        </w:rPr>
-        <w:t xml:space="preserve">“Lưu tất cả”</w:t>
-      </w:r>
-      <w:r>
-        <w:rPr>
-          <w:rFonts w:ascii="Calibri" w:cs="Calibri" w:eastAsia="Calibri" w:hAnsi="Calibri"/>
-          <w:sz w:val="22"/>
-          <w:szCs w:val="22"/>
-        </w:rPr>
-        <w:t xml:space="preserve">.</w:t>
-      </w:r>
-    </w:p>
-    <w:p>“Xuất Excel”: tải bảng điểm ra CSV → sửa offline → “Nhập điểm”. “Khóa điểm”: chốt, không sửa được.</w:p>
-    <w:p>
-      <w:pPr>
-        <w:spacing w:after="120"/>
-      </w:pPr>
-      <w:r>
-        <w:rPr>
-          <w:rFonts w:ascii="Calibri" w:cs="Calibri" w:eastAsia="Calibri" w:hAnsi="Calibri"/>
-          <w:b/>
-          <w:bCs/>
-          <w:sz w:val="22"/>
-          <w:szCs w:val="22"/>
-        </w:rPr>
-        <w:t xml:space="preserve">Lưu ý: </w:t>
-      </w:r>
-      <w:r>
-        <w:rPr>
-          <w:rFonts w:ascii="Calibri" w:cs="Calibri" w:eastAsia="Calibri" w:hAnsi="Calibri"/>
-          <w:b/>
-          <w:bCs/>
-          <w:sz w:val="22"/>
-          <w:szCs w:val="22"/>
-        </w:rPr>
-        <w:t xml:space="preserve">Phân quyền nhập điểm: </w:t>
-      </w:r>
-      <w:r>
-        <w:rPr>
-          <w:rFonts w:ascii="Calibri" w:cs="Calibri" w:eastAsia="Calibri" w:hAnsi="Calibri"/>
-          <w:sz w:val="22"/>
-          <w:szCs w:val="22"/>
-        </w:rPr>
-        <w:t xml:space="preserve">cố vấn chỉ lưu được điểm của sinh viên mình phụ trách. Lớp học phần trộn nhiều ngành/khóa → nhập cả lớp bằng tài khoản </w:t>
-      </w:r>
-      <w:r>
-        <w:rPr>
-          <w:rFonts w:ascii="Calibri" w:cs="Calibri" w:eastAsia="Calibri" w:hAnsi="Calibri"/>
-          <w:b/>
-          <w:bCs/>
-          <w:sz w:val="22"/>
-          <w:szCs w:val="22"/>
-        </w:rPr>
-        <w:t xml:space="preserve">Quản lý</w:t>
-      </w:r>
-      <w:r>
-        <w:rPr>
-          <w:rFonts w:ascii="Calibri" w:cs="Calibri" w:eastAsia="Calibri" w:hAnsi="Calibri"/>
-          <w:sz w:val="22"/>
-          <w:szCs w:val="22"/>
-        </w:rPr>
-        <w:t xml:space="preserve">, hoặc nạp từ hệ thống trường qua Nhập CSV / Đồng bộ SIS-LMS.</w:t>
+        <w:t xml:space="preserve">5.1. Nhập từ Excel theo MSSV</w:t>
+      </w:r>
+    </w:p>
+    <w:p>
+      “Nhập điểm” → chọn file → 
+      <w:r>
+        <w:rPr>
+          <w:rFonts w:ascii="Calibri" w:cs="Calibri" w:eastAsia="Calibri" w:hAnsi="Calibri"/>
+          <w:b/>
+          <w:bCs/>
+          <w:sz w:val="22"/>
+          <w:szCs w:val="22"/>
+        </w:rPr>
+        <w:t xml:space="preserve">xem trước (hợp lệ/lỗi)</w:t>
+      </w:r>
+      <w:r>
+        <w:rPr>
+          <w:rFonts w:ascii="Calibri" w:cs="Calibri" w:eastAsia="Calibri" w:hAnsi="Calibri"/>
+          <w:sz w:val="22"/>
+          <w:szCs w:val="22"/>
+        </w:rPr>
+        <w:t xml:space="preserve"> → “Xác nhận nhập”. Cột: student_code, course_code, course_name, credits, semester, academic_year, weight_*, score_*.</w:t>
       </w:r>
     </w:p>
     <w:p>
@@ -2187,45 +2135,7 @@
           <w:sz w:val="23"/>
           <w:szCs w:val="23"/>
         </w:rPr>
-        <w:t xml:space="preserve">5.2. Nhập từ Excel theo MSSV</w:t>
-      </w:r>
-    </w:p>
-    <w:p>
-      “Nhập điểm” → chọn file → 
-      <w:r>
-        <w:rPr>
-          <w:rFonts w:ascii="Calibri" w:cs="Calibri" w:eastAsia="Calibri" w:hAnsi="Calibri"/>
-          <w:b/>
-          <w:bCs/>
-          <w:sz w:val="22"/>
-          <w:szCs w:val="22"/>
-        </w:rPr>
-        <w:t xml:space="preserve">xem trước (hợp lệ/lỗi)</w:t>
-      </w:r>
-      <w:r>
-        <w:rPr>
-          <w:rFonts w:ascii="Calibri" w:cs="Calibri" w:eastAsia="Calibri" w:hAnsi="Calibri"/>
-          <w:sz w:val="22"/>
-          <w:szCs w:val="22"/>
-        </w:rPr>
-        <w:t xml:space="preserve"> → “Xác nhận nhập”. Cột: student_code, course_code, course_name, credits, semester, academic_year, weight_*, score_*.</w:t>
-      </w:r>
-    </w:p>
-    <w:p>
-      <w:pPr>
-        <w:pStyle w:val="Heading2"/>
-        <w:spacing w:after="70" w:before="190"/>
-      </w:pPr>
-      <w:r>
-        <w:rPr>
-          <w:rFonts w:ascii="Calibri" w:cs="Calibri" w:eastAsia="Calibri" w:hAnsi="Calibri"/>
-          <w:b/>
-          <w:bCs/>
-          <w:color w:val="13294F"/>
-          <w:sz w:val="23"/>
-          <w:szCs w:val="23"/>
-        </w:rPr>
-        <w:t xml:space="preserve">5.3. Nhập tay từng môn</w:t>
+        <w:t xml:space="preserve">5.2. Nhập tay từng môn trong hồ sơ sinh viên</w:t>
       </w:r>
     </w:p>
     <w:p>
@@ -2243,7 +2153,40 @@
           <w:sz w:val="22"/>
           <w:szCs w:val="22"/>
         </w:rPr>
-        <w:t xml:space="preserve">Trong chi tiết sinh viên — nhập TX/GK/CK từng môn (điểm 0–10).</w:t>
+        <w:t xml:space="preserve">Chi tiết sinh viên — bảng điểm nhóm theo từng học kỳ; nhập TX/GK/CK từng môn (điểm 0–10); cuối bảng hiển thị điểm TB tích lũy hệ 10 / hệ 4 và tổng tín chỉ tích lũy.</w:t>
+      </w:r>
+    </w:p>
+    <w:p>
+      <w:pPr>
+        <w:spacing w:after="120"/>
+      </w:pPr>
+      <w:r>
+        <w:rPr>
+          <w:rFonts w:ascii="Calibri" w:cs="Calibri" w:eastAsia="Calibri" w:hAnsi="Calibri"/>
+          <w:b/>
+          <w:bCs/>
+          <w:sz w:val="22"/>
+          <w:szCs w:val="22"/>
+        </w:rPr>
+        <w:t xml:space="preserve">Lưu ý: </w:t>
+      </w:r>
+      <w:r>
+        <w:rPr>
+          <w:rFonts w:ascii="Calibri" w:cs="Calibri" w:eastAsia="Calibri" w:hAnsi="Calibri"/>
+          <w:b/>
+          <w:bCs/>
+          <w:sz w:val="22"/>
+          <w:szCs w:val="22"/>
+        </w:rPr>
+        <w:t xml:space="preserve">Phân quyền: </w:t>
+      </w:r>
+      <w:r>
+        <w:rPr>
+          <w:rFonts w:ascii="Calibri" w:cs="Calibri" w:eastAsia="Calibri" w:hAnsi="Calibri"/>
+          <w:sz w:val="22"/>
+          <w:szCs w:val="22"/>
+        </w:rPr>
+        <w:t xml:space="preserve">cố vấn chỉ lưu được điểm của sinh viên mình phụ trách; điểm cả lớp nạp từ hệ thống trường qua Nhập CSV / Đồng bộ SIS-LMS.</w:t>
       </w:r>
     </w:p>
     <w:p>
@@ -2638,7 +2581,7 @@
         <w:pStyle w:val="ListParagraph"/>
         <w:numPr>
           <w:ilvl w:val="0"/>
-          <w:numId w:val="6"/>
+          <w:numId w:val="5"/>
         </w:numPr>
         <w:spacing w:after="70"/>
       </w:pPr>
@@ -2666,7 +2609,7 @@
         <w:pStyle w:val="ListParagraph"/>
         <w:numPr>
           <w:ilvl w:val="0"/>
-          <w:numId w:val="6"/>
+          <w:numId w:val="5"/>
         </w:numPr>
         <w:spacing w:after="70"/>
       </w:pPr>
@@ -3079,12 +3022,6 @@
     </w:lvlOverride>
   </w:num>
   <w:num w:numId="5">
-    <w:abstractNumId w:val="3"/>
-    <w:lvlOverride w:ilvl="0">
-      <w:startOverride w:val="1"/>
-    </w:lvlOverride>
-  </w:num>
-  <w:num w:numId="6">
     <w:abstractNumId w:val="3"/>
     <w:lvlOverride w:ilvl="0">
       <w:startOverride w:val="1"/>

</xml_diff>

<commit_message>
Docs: guides cover the Classes feature + teacher role
- Tóm tắt: 15/07 milestone (Classes + teacher role), a "Lớp học" feature
  row, 4-role wording (SV/Giáo viên/Cố vấn/Quản lý), teacher-classes.sql
  in the migration + "already run" lists, i18n 373, wireframe/prototype
  deliverables refreshed (3 roles + Figma kit).
- Hướng dẫn sử dụng: dashboard menu gains a "Lớp học" row; new section 9
  (create class, per-session attendance → attendance rate, TX/GK/CK
  component grades); 1.2 lists 4 roles + teacher SQL; config note adds
  teacher-classes.sql.
- Tổng quan đề tài: Classes (attendance + component grades) and the
  distinct teacher role added to the main feature list.
Regenerated both PDFs.

Co-Authored-By: Claude Fable 5 <noreply@anthropic.com>
</commit_message>
<xml_diff>
--- a/Project for Capstone 2/student_risk_system/Huong-dan-su-dung-web.docx
+++ b/Project for Capstone 2/student_risk_system/Huong-dan-su-dung-web.docx
@@ -62,7 +62,7 @@
         </w:rPr>
         <w:t xml:space="preserve">Địa chỉ:  </w:t>
       </w:r>
-      <w:hyperlink w:history="1" r:id="rId050rqvnsqbkylkak4gykl">
+      <w:hyperlink w:history="1" r:id="rIdx6xjjf0u0k2_hrzfgtqhr">
         <w:r>
           <w:rPr>
             <w:rFonts w:ascii="Calibri" w:cs="Calibri" w:eastAsia="Calibri" w:hAnsi="Calibri"/>
@@ -1469,7 +1469,7 @@
           <w:sz w:val="23"/>
           <w:szCs w:val="23"/>
         </w:rPr>
-        <w:t xml:space="preserve">1.2. Tài khoản Cố vấn / Quản lý</w:t>
+        <w:t xml:space="preserve">1.2. Tài khoản Cố vấn / Giáo viên / Quản lý</w:t>
       </w:r>
     </w:p>
     <w:p>
@@ -1487,7 +1487,7 @@
           <w:sz w:val="22"/>
           <w:szCs w:val="22"/>
         </w:rPr>
-        <w:t xml:space="preserve">Do quản trị tạo trong Supabase (Authentication → Users) + đặt role trong bảng profiles bằng SQL. Không có đăng ký công khai.</w:t>
+        <w:t xml:space="preserve">Do quản trị tạo trong Supabase (Authentication → Users) + đặt role trong bảng profiles bằng SQL. Không có đăng ký công khai. 4 vai trò: student · teacher · advisor · manager.</w:t>
       </w:r>
     </w:p>
     <w:p>
@@ -1501,6 +1501,24 @@
           <w:szCs w:val="22"/>
         </w:rPr>
         <w:t xml:space="preserve">advisor@demo.edu.vn</w:t>
+      </w:r>
+      <w:r>
+        <w:rPr>
+          <w:rFonts w:ascii="Calibri" w:cs="Calibri" w:eastAsia="Calibri" w:hAnsi="Calibri"/>
+          <w:sz w:val="22"/>
+          <w:szCs w:val="22"/>
+        </w:rPr>
+        <w:t xml:space="preserve"> · giáo viên demo: </w:t>
+      </w:r>
+      <w:r>
+        <w:rPr>
+          <w:rFonts w:ascii="Calibri" w:cs="Calibri" w:eastAsia="Calibri" w:hAnsi="Calibri"/>
+          <w:b/>
+          <w:bCs/>
+          <w:sz w:val="22"/>
+          <w:szCs w:val="22"/>
+        </w:rPr>
+        <w:t xml:space="preserve">teacher@demo.edu.vn</w:t>
       </w:r>
       <w:r>
         <w:rPr>
@@ -1524,6 +1542,21 @@
           <w:szCs w:val="18"/>
         </w:rPr>
         <w:t xml:space="preserve">update public.profiles set role='advisor', program='Hệ thống thông tin quản lý' where email='...';</w:t>
+      </w:r>
+    </w:p>
+    <w:p>
+      <w:pPr>
+        <w:shd w:fill="F4F4F4" w:val="clear"/>
+        <w:spacing w:after="55"/>
+        <w:ind w:left="120"/>
+      </w:pPr>
+      <w:r>
+        <w:rPr>
+          <w:rFonts w:ascii="Consolas" w:cs="Consolas" w:eastAsia="Consolas" w:hAnsi="Consolas"/>
+          <w:sz w:val="18"/>
+          <w:szCs w:val="18"/>
+        </w:rPr>
+        <w:t xml:space="preserve">update public.profiles set role='teacher' where email='...';   -- cần chạy teacher-classes.sql trước</w:t>
       </w:r>
     </w:p>
     <w:p>
@@ -1924,7 +1957,7 @@
                 <w:sz w:val="20"/>
                 <w:szCs w:val="20"/>
               </w:rPr>
-              <w:t xml:space="preserve">Cảnh báo &amp; Can thiệp</w:t>
+              <w:t xml:space="preserve">Lớp học</w:t>
             </w:r>
           </w:p>
         </w:tc>
@@ -1950,7 +1983,7 @@
                 <w:sz w:val="20"/>
                 <w:szCs w:val="20"/>
               </w:rPr>
-              <w:t xml:space="preserve">Một trang chung: xử lý cảnh báo theo trạng thái (kèm cảnh báo tổ hợp nhiều điều kiện) + nhật ký can thiệp phía dưới</w:t>
+              <w:t xml:space="preserve">Tạo lớp học phần; điểm danh theo buổi (tự cập nhật chuyên cần); nhập điểm thành phần TX/GK/CK cho cả lớp (dành cho cố vấn kiêm giảng dạy — xem mục 9)</w:t>
             </w:r>
           </w:p>
         </w:tc>
@@ -1979,7 +2012,7 @@
                 <w:sz w:val="20"/>
                 <w:szCs w:val="20"/>
               </w:rPr>
-              <w:t xml:space="preserve">Tin nhắn</w:t>
+              <w:t xml:space="preserve">Cảnh báo &amp; Can thiệp</w:t>
             </w:r>
           </w:p>
         </w:tc>
@@ -2006,7 +2039,7 @@
                 <w:sz w:val="20"/>
                 <w:szCs w:val="20"/>
               </w:rPr>
-              <w:t xml:space="preserve">Hỏi đáp trực tiếp với sinh viên (realtime)</w:t>
+              <w:t xml:space="preserve">Một trang chung: xử lý cảnh báo theo trạng thái (kèm cảnh báo tổ hợp nhiều điều kiện) + nhật ký can thiệp phía dưới</w:t>
             </w:r>
           </w:p>
         </w:tc>
@@ -2034,6 +2067,61 @@
                 <w:sz w:val="20"/>
                 <w:szCs w:val="20"/>
               </w:rPr>
+              <w:t xml:space="preserve">Tin nhắn</w:t>
+            </w:r>
+          </w:p>
+        </w:tc>
+        <w:tc>
+          <w:tcPr>
+            <w:tcW w:type="dxa" w:w="6860"/>
+            <w:tcMar>
+              <w:top w:type="dxa" w:w="58"/>
+              <w:left w:type="dxa" w:w="95"/>
+              <w:bottom w:type="dxa" w:w="58"/>
+              <w:right w:type="dxa" w:w="95"/>
+            </w:tcMar>
+          </w:tcPr>
+          <w:p>
+            <w:pPr>
+              <w:spacing w:after="0"/>
+            </w:pPr>
+            <w:r>
+              <w:rPr>
+                <w:rFonts w:ascii="Calibri" w:cs="Calibri" w:eastAsia="Calibri" w:hAnsi="Calibri"/>
+                <w:b w:val="false"/>
+                <w:bCs w:val="false"/>
+                <w:sz w:val="20"/>
+                <w:szCs w:val="20"/>
+              </w:rPr>
+              <w:t xml:space="preserve">Hỏi đáp trực tiếp với sinh viên (realtime)</w:t>
+            </w:r>
+          </w:p>
+        </w:tc>
+      </w:tr>
+      <w:tr>
+        <w:tc>
+          <w:tcPr>
+            <w:tcW w:type="dxa" w:w="2500"/>
+            <w:shd w:fill="EEF2F8" w:val="clear"/>
+            <w:tcMar>
+              <w:top w:type="dxa" w:w="58"/>
+              <w:left w:type="dxa" w:w="95"/>
+              <w:bottom w:type="dxa" w:w="58"/>
+              <w:right w:type="dxa" w:w="95"/>
+            </w:tcMar>
+          </w:tcPr>
+          <w:p>
+            <w:pPr>
+              <w:spacing w:after="0"/>
+            </w:pPr>
+            <w:r>
+              <w:rPr>
+                <w:rFonts w:ascii="Calibri" w:cs="Calibri" w:eastAsia="Calibri" w:hAnsi="Calibri"/>
+                <w:b w:val="false"/>
+                <w:bCs w:val="false"/>
+                <w:sz w:val="20"/>
+                <w:szCs w:val="20"/>
+              </w:rPr>
               <w:t xml:space="preserve">Đánh giá</w:t>
             </w:r>
           </w:p>
@@ -2041,6 +2129,7 @@
         <w:tc>
           <w:tcPr>
             <w:tcW w:type="dxa" w:w="6860"/>
+            <w:shd w:fill="EEF2F8" w:val="clear"/>
             <w:tcMar>
               <w:top w:type="dxa" w:w="58"/>
               <w:left w:type="dxa" w:w="95"/>
@@ -2744,6 +2833,197 @@
       </w:r>
     </w:p>
     <w:p>
+      <w:r>
+        <w:br w:type="page"/>
+      </w:r>
+    </w:p>
+    <w:p>
+      <w:pPr>
+        <w:pStyle w:val="Heading1"/>
+        <w:spacing w:after="110" w:before="280"/>
+      </w:pPr>
+      <w:r>
+        <w:rPr>
+          <w:rFonts w:ascii="Calibri" w:cs="Calibri" w:eastAsia="Calibri" w:hAnsi="Calibri"/>
+          <w:b/>
+          <w:bCs/>
+          <w:color w:val="13294F"/>
+          <w:sz w:val="28"/>
+          <w:szCs w:val="28"/>
+        </w:rPr>
+        <w:t xml:space="preserve">9. Lớp học — điểm danh &amp; nhập điểm thành phần (giáo viên)</w:t>
+      </w:r>
+    </w:p>
+    <w:p>
+      <w:pPr>
+        <w:spacing w:after="110"/>
+      </w:pPr>
+      <w:r>
+        <w:rPr>
+          <w:rFonts w:ascii="Calibri" w:cs="Calibri" w:eastAsia="Calibri" w:hAnsi="Calibri"/>
+          <w:sz w:val="22"/>
+          <w:szCs w:val="22"/>
+        </w:rPr>
+        <w:t xml:space="preserve">Dành cho người dạy học phần. Cố vấn có thể kiêm giảng dạy nên bảng cố vấn cũng có mục “Lớp học”; giáo viên thuần (role = teacher) đăng nhập vào thẳng trang này (/teacher).</w:t>
+      </w:r>
+    </w:p>
+    <w:p>
+      <w:pPr>
+        <w:pStyle w:val="Heading2"/>
+        <w:spacing w:after="70" w:before="190"/>
+      </w:pPr>
+      <w:r>
+        <w:rPr>
+          <w:rFonts w:ascii="Calibri" w:cs="Calibri" w:eastAsia="Calibri" w:hAnsi="Calibri"/>
+          <w:b/>
+          <w:bCs/>
+          <w:color w:val="13294F"/>
+          <w:sz w:val="23"/>
+          <w:szCs w:val="23"/>
+        </w:rPr>
+        <w:t xml:space="preserve">9.1. Tạo lớp &amp; chọn lớp</w:t>
+      </w:r>
+    </w:p>
+    <w:p>
+      Menu 
+      <w:r>
+        <w:rPr>
+          <w:rFonts w:ascii="Calibri" w:cs="Calibri" w:eastAsia="Calibri" w:hAnsi="Calibri"/>
+          <w:b/>
+          <w:bCs/>
+          <w:sz w:val="22"/>
+          <w:szCs w:val="22"/>
+        </w:rPr>
+        <w:t xml:space="preserve">“Lớp học”</w:t>
+      </w:r>
+      <w:r>
+        <w:rPr>
+          <w:rFonts w:ascii="Calibri" w:cs="Calibri" w:eastAsia="Calibri" w:hAnsi="Calibri"/>
+          <w:sz w:val="22"/>
+          <w:szCs w:val="22"/>
+        </w:rPr>
+        <w:t xml:space="preserve"> → “Thêm lớp” → nhập Mã môn, Tên môn, Số tín chỉ, Học kỳ, Năm học → “Tạo lớp”.</w:t>
+      </w:r>
+    </w:p>
+    <w:p>
+      Chọn lớp ở ô “Chọn lớp”. Danh sách sinh viên tự lấy từ các bản ghi điểm có cùng 
+      <w:r>
+        <w:rPr>
+          <w:rFonts w:ascii="Calibri" w:cs="Calibri" w:eastAsia="Calibri" w:hAnsi="Calibri"/>
+          <w:b/>
+          <w:bCs/>
+          <w:sz w:val="22"/>
+          <w:szCs w:val="22"/>
+        </w:rPr>
+        <w:t xml:space="preserve">Mã môn + Học kỳ + Năm học</w:t>
+      </w:r>
+      <w:r>
+        <w:rPr>
+          <w:rFonts w:ascii="Calibri" w:cs="Calibri" w:eastAsia="Calibri" w:hAnsi="Calibri"/>
+          <w:sz w:val="22"/>
+          <w:szCs w:val="22"/>
+        </w:rPr>
+        <w:t xml:space="preserve">.</w:t>
+      </w:r>
+    </w:p>
+    <w:p>
+      <w:pPr>
+        <w:pStyle w:val="Heading2"/>
+        <w:spacing w:after="70" w:before="190"/>
+      </w:pPr>
+      <w:r>
+        <w:rPr>
+          <w:rFonts w:ascii="Calibri" w:cs="Calibri" w:eastAsia="Calibri" w:hAnsi="Calibri"/>
+          <w:b/>
+          <w:bCs/>
+          <w:color w:val="13294F"/>
+          <w:sz w:val="23"/>
+          <w:szCs w:val="23"/>
+        </w:rPr>
+        <w:t xml:space="preserve">9.2. Điểm danh</w:t>
+      </w:r>
+    </w:p>
+    <w:p>
+      Tab 
+      <w:r>
+        <w:rPr>
+          <w:rFonts w:ascii="Calibri" w:cs="Calibri" w:eastAsia="Calibri" w:hAnsi="Calibri"/>
+          <w:b/>
+          <w:bCs/>
+          <w:sz w:val="22"/>
+          <w:szCs w:val="22"/>
+        </w:rPr>
+        <w:t xml:space="preserve">“Điểm danh”</w:t>
+      </w:r>
+      <w:r>
+        <w:rPr>
+          <w:rFonts w:ascii="Calibri" w:cs="Calibri" w:eastAsia="Calibri" w:hAnsi="Calibri"/>
+          <w:sz w:val="22"/>
+          <w:szCs w:val="22"/>
+        </w:rPr>
+        <w:t xml:space="preserve"> → chọn Buổi ngày → tick “Có mặt” cho từng SV → “Lưu điểm danh”.</w:t>
+      </w:r>
+    </w:p>
+    <w:p>
+      Lưu sẽ 
+      <w:r>
+        <w:rPr>
+          <w:rFonts w:ascii="Calibri" w:cs="Calibri" w:eastAsia="Calibri" w:hAnsi="Calibri"/>
+          <w:b/>
+          <w:bCs/>
+          <w:sz w:val="22"/>
+          <w:szCs w:val="22"/>
+        </w:rPr>
+        <w:t xml:space="preserve">tự cập nhật tỷ lệ chuyên cần</w:t>
+      </w:r>
+      <w:r>
+        <w:rPr>
+          <w:rFonts w:ascii="Calibri" w:cs="Calibri" w:eastAsia="Calibri" w:hAnsi="Calibri"/>
+          <w:sz w:val="22"/>
+          <w:szCs w:val="22"/>
+        </w:rPr>
+        <w:t xml:space="preserve"> của sinh viên → ảnh hưởng điểm rủi ro.</w:t>
+      </w:r>
+    </w:p>
+    <w:p>
+      <w:pPr>
+        <w:pStyle w:val="Heading2"/>
+        <w:spacing w:after="70" w:before="190"/>
+      </w:pPr>
+      <w:r>
+        <w:rPr>
+          <w:rFonts w:ascii="Calibri" w:cs="Calibri" w:eastAsia="Calibri" w:hAnsi="Calibri"/>
+          <w:b/>
+          <w:bCs/>
+          <w:color w:val="13294F"/>
+          <w:sz w:val="23"/>
+          <w:szCs w:val="23"/>
+        </w:rPr>
+        <w:t xml:space="preserve">9.3. Nhập điểm thành phần</w:t>
+      </w:r>
+    </w:p>
+    <w:p>
+      Tab 
+      <w:r>
+        <w:rPr>
+          <w:rFonts w:ascii="Calibri" w:cs="Calibri" w:eastAsia="Calibri" w:hAnsi="Calibri"/>
+          <w:b/>
+          <w:bCs/>
+          <w:sz w:val="22"/>
+          <w:szCs w:val="22"/>
+        </w:rPr>
+        <w:t xml:space="preserve">“Nhập điểm”</w:t>
+      </w:r>
+      <w:r>
+        <w:rPr>
+          <w:rFonts w:ascii="Calibri" w:cs="Calibri" w:eastAsia="Calibri" w:hAnsi="Calibri"/>
+          <w:sz w:val="22"/>
+          <w:szCs w:val="22"/>
+        </w:rPr>
+        <w:t xml:space="preserve">: gõ TX/GK/CK cho từng SV trong lớp → “Lưu điểm”. Tổng &amp; điểm chữ tính tự động (trọng số TX 0.2 · GK 0.3 · CK 0.5). Điểm này hiện luôn ở cổng sinh viên và tính vào rủi ro.</w:t>
+      </w:r>
+    </w:p>
+    <w:p>
       <w:pPr>
         <w:spacing w:after="120"/>
       </w:pPr>
@@ -2755,6 +3035,47 @@
           <w:sz w:val="22"/>
           <w:szCs w:val="22"/>
         </w:rPr>
+        <w:t xml:space="preserve">Lưu ý: </w:t>
+      </w:r>
+      <w:r>
+        <w:rPr>
+          <w:rFonts w:ascii="Calibri" w:cs="Calibri" w:eastAsia="Calibri" w:hAnsi="Calibri"/>
+          <w:sz w:val="22"/>
+          <w:szCs w:val="22"/>
+        </w:rPr>
+        <w:t xml:space="preserve">Cần chạy </w:t>
+      </w:r>
+      <w:r>
+        <w:rPr>
+          <w:rFonts w:ascii="Calibri" w:cs="Calibri" w:eastAsia="Calibri" w:hAnsi="Calibri"/>
+          <w:b/>
+          <w:bCs/>
+          <w:sz w:val="22"/>
+          <w:szCs w:val="22"/>
+        </w:rPr>
+        <w:t xml:space="preserve">teacher-classes.sql</w:t>
+      </w:r>
+      <w:r>
+        <w:rPr>
+          <w:rFonts w:ascii="Calibri" w:cs="Calibri" w:eastAsia="Calibri" w:hAnsi="Calibri"/>
+          <w:sz w:val="22"/>
+          <w:szCs w:val="22"/>
+        </w:rPr>
+        <w:t xml:space="preserve"> trong Supabase SQL Editor để bật vai trò teacher + bảng sections/attendance (kèm RLS). Hệ thống hiện tại ĐÃ chạy.</w:t>
+      </w:r>
+    </w:p>
+    <w:p>
+      <w:pPr>
+        <w:spacing w:after="120"/>
+      </w:pPr>
+      <w:r>
+        <w:rPr>
+          <w:rFonts w:ascii="Calibri" w:cs="Calibri" w:eastAsia="Calibri" w:hAnsi="Calibri"/>
+          <w:b/>
+          <w:bCs/>
+          <w:sz w:val="22"/>
+          <w:szCs w:val="22"/>
+        </w:rPr>
         <w:t xml:space="preserve">Cấu hình: </w:t>
       </w:r>
       <w:r>
@@ -2773,7 +3094,7 @@
           <w:sz w:val="22"/>
           <w:szCs w:val="22"/>
         </w:rPr>
-        <w:t xml:space="preserve">risk-config, grade-lock, appointments, rls-major-scope</w:t>
+        <w:t xml:space="preserve">risk-config, grade-lock, appointments, rls-major-scope, teacher-classes</w:t>
       </w:r>
       <w:r>
         <w:rPr>
@@ -3022,6 +3343,18 @@
     </w:lvlOverride>
   </w:num>
   <w:num w:numId="5">
+    <w:abstractNumId w:val="3"/>
+    <w:lvlOverride w:ilvl="0">
+      <w:startOverride w:val="1"/>
+    </w:lvlOverride>
+  </w:num>
+  <w:num w:numId="6">
+    <w:abstractNumId w:val="3"/>
+    <w:lvlOverride w:ilvl="0">
+      <w:startOverride w:val="1"/>
+    </w:lvlOverride>
+  </w:num>
+  <w:num w:numId="7">
     <w:abstractNumId w:val="3"/>
     <w:lvlOverride w:ilvl="0">
       <w:startOverride w:val="1"/>

</xml_diff>

<commit_message>
Docs: split Classes into Attendance + Grades across wireframes, prototype guide & deliverables
- Wireframe-Advisor: 10 screens; every sidebar now lists Attendance + Grades
  as separate items; old "Classes" screen split into Attendance (8) + Grades (9).
- Wireframe-Teacher: 4 screens; add 2-item sidebar (Attendance / Grades);
  split the single Classes screen into Attendance (3) + Grades (4).
- Regenerate both wireframe PDFs + PNGs.
- Prototype-Figma-huong-dan.md: 17 frames (advisor 05-attendance/06-grades,
  teacher 03-attendance/04-grades); rewire advisor (7-item sidebar) & teacher flows.
- Huong-dan-su-dung-web + Tom-tat-cuoc-chat (docx+pdf): describe the two pages
  as separate left-menu items (not tabs); log the split milestone.
- .claude/launch.json: replace stale legacy "webapp" preview with a "wireframes"
  static server (deleted Flask folder no longer exists).

Co-Authored-By: Claude Opus 4.8 <noreply@anthropic.com>
</commit_message>
<xml_diff>
--- a/Project for Capstone 2/student_risk_system/Huong-dan-su-dung-web.docx
+++ b/Project for Capstone 2/student_risk_system/Huong-dan-su-dung-web.docx
@@ -62,7 +62,7 @@
         </w:rPr>
         <w:t xml:space="preserve">Địa chỉ:  </w:t>
       </w:r>
-      <w:hyperlink w:history="1" r:id="rIdx6xjjf0u0k2_hrzfgtqhr">
+      <w:hyperlink w:history="1" r:id="rIdzgh1bt0spq3nq0gj2zqkf">
         <w:r>
           <w:rPr>
             <w:rFonts w:ascii="Calibri" w:cs="Calibri" w:eastAsia="Calibri" w:hAnsi="Calibri"/>
@@ -1957,7 +1957,7 @@
                 <w:sz w:val="20"/>
                 <w:szCs w:val="20"/>
               </w:rPr>
-              <w:t xml:space="preserve">Lớp học</w:t>
+              <w:t xml:space="preserve">Điểm danh</w:t>
             </w:r>
           </w:p>
         </w:tc>
@@ -1983,7 +1983,7 @@
                 <w:sz w:val="20"/>
                 <w:szCs w:val="20"/>
               </w:rPr>
-              <w:t xml:space="preserve">Tạo lớp học phần; điểm danh theo buổi (tự cập nhật chuyên cần); nhập điểm thành phần TX/GK/CK cho cả lớp (dành cho cố vấn kiêm giảng dạy — xem mục 9)</w:t>
+              <w:t xml:space="preserve">Tạo lớp học phần; điểm danh theo buổi (tự cập nhật chuyên cần) cho cả lớp (dành cho cố vấn kiêm giảng dạy — xem mục 9)</w:t>
             </w:r>
           </w:p>
         </w:tc>
@@ -2012,7 +2012,7 @@
                 <w:sz w:val="20"/>
                 <w:szCs w:val="20"/>
               </w:rPr>
-              <w:t xml:space="preserve">Cảnh báo &amp; Can thiệp</w:t>
+              <w:t xml:space="preserve">Nhập điểm</w:t>
             </w:r>
           </w:p>
         </w:tc>
@@ -2039,7 +2039,7 @@
                 <w:sz w:val="20"/>
                 <w:szCs w:val="20"/>
               </w:rPr>
-              <w:t xml:space="preserve">Một trang chung: xử lý cảnh báo theo trạng thái (kèm cảnh báo tổ hợp nhiều điều kiện) + nhật ký can thiệp phía dưới</w:t>
+              <w:t xml:space="preserve">Nhập điểm thành phần TX/GK/CK cho cả lớp học phần (dành cho cố vấn kiêm giảng dạy — xem mục 9)</w:t>
             </w:r>
           </w:p>
         </w:tc>
@@ -2067,7 +2067,7 @@
                 <w:sz w:val="20"/>
                 <w:szCs w:val="20"/>
               </w:rPr>
-              <w:t xml:space="preserve">Tin nhắn</w:t>
+              <w:t xml:space="preserve">Cảnh báo &amp; Can thiệp</w:t>
             </w:r>
           </w:p>
         </w:tc>
@@ -2093,7 +2093,7 @@
                 <w:sz w:val="20"/>
                 <w:szCs w:val="20"/>
               </w:rPr>
-              <w:t xml:space="preserve">Hỏi đáp trực tiếp với sinh viên (realtime)</w:t>
+              <w:t xml:space="preserve">Một trang chung: xử lý cảnh báo theo trạng thái (kèm cảnh báo tổ hợp nhiều điều kiện) + nhật ký can thiệp phía dưới</w:t>
             </w:r>
           </w:p>
         </w:tc>
@@ -2122,7 +2122,7 @@
                 <w:sz w:val="20"/>
                 <w:szCs w:val="20"/>
               </w:rPr>
-              <w:t xml:space="preserve">Đánh giá</w:t>
+              <w:t xml:space="preserve">Tin nhắn</w:t>
             </w:r>
           </w:p>
         </w:tc>
@@ -2130,6 +2130,60 @@
           <w:tcPr>
             <w:tcW w:type="dxa" w:w="6860"/>
             <w:shd w:fill="EEF2F8" w:val="clear"/>
+            <w:tcMar>
+              <w:top w:type="dxa" w:w="58"/>
+              <w:left w:type="dxa" w:w="95"/>
+              <w:bottom w:type="dxa" w:w="58"/>
+              <w:right w:type="dxa" w:w="95"/>
+            </w:tcMar>
+          </w:tcPr>
+          <w:p>
+            <w:pPr>
+              <w:spacing w:after="0"/>
+            </w:pPr>
+            <w:r>
+              <w:rPr>
+                <w:rFonts w:ascii="Calibri" w:cs="Calibri" w:eastAsia="Calibri" w:hAnsi="Calibri"/>
+                <w:b w:val="false"/>
+                <w:bCs w:val="false"/>
+                <w:sz w:val="20"/>
+                <w:szCs w:val="20"/>
+              </w:rPr>
+              <w:t xml:space="preserve">Hỏi đáp trực tiếp với sinh viên (realtime)</w:t>
+            </w:r>
+          </w:p>
+        </w:tc>
+      </w:tr>
+      <w:tr>
+        <w:tc>
+          <w:tcPr>
+            <w:tcW w:type="dxa" w:w="2500"/>
+            <w:tcMar>
+              <w:top w:type="dxa" w:w="58"/>
+              <w:left w:type="dxa" w:w="95"/>
+              <w:bottom w:type="dxa" w:w="58"/>
+              <w:right w:type="dxa" w:w="95"/>
+            </w:tcMar>
+          </w:tcPr>
+          <w:p>
+            <w:pPr>
+              <w:spacing w:after="0"/>
+            </w:pPr>
+            <w:r>
+              <w:rPr>
+                <w:rFonts w:ascii="Calibri" w:cs="Calibri" w:eastAsia="Calibri" w:hAnsi="Calibri"/>
+                <w:b w:val="false"/>
+                <w:bCs w:val="false"/>
+                <w:sz w:val="20"/>
+                <w:szCs w:val="20"/>
+              </w:rPr>
+              <w:t xml:space="preserve">Đánh giá</w:t>
+            </w:r>
+          </w:p>
+        </w:tc>
+        <w:tc>
+          <w:tcPr>
+            <w:tcW w:type="dxa" w:w="6860"/>
             <w:tcMar>
               <w:top w:type="dxa" w:w="58"/>
               <w:left w:type="dxa" w:w="95"/>
@@ -2851,7 +2905,7 @@
           <w:sz w:val="28"/>
           <w:szCs w:val="28"/>
         </w:rPr>
-        <w:t xml:space="preserve">9. Lớp học — điểm danh &amp; nhập điểm thành phần (giáo viên)</w:t>
+        <w:t xml:space="preserve">9. Điểm danh &amp; Nhập điểm (giáo viên)</w:t>
       </w:r>
     </w:p>
     <w:p>
@@ -2864,7 +2918,7 @@
           <w:sz w:val="22"/>
           <w:szCs w:val="22"/>
         </w:rPr>
-        <w:t xml:space="preserve">Dành cho người dạy học phần. Cố vấn có thể kiêm giảng dạy nên bảng cố vấn cũng có mục “Lớp học”; giáo viên thuần (role = teacher) đăng nhập vào thẳng trang này (/teacher).</w:t>
+        <w:t xml:space="preserve">Dành cho người dạy học phần. Menu bên trái có 2 mục riêng — “Điểm danh” và “Nhập điểm”. Cố vấn có thể kiêm giảng dạy nên bảng cố vấn cũng có 2 mục này; giáo viên thuần (role = teacher) đăng nhập vào thẳng trang này (/teacher).</w:t>
       </w:r>
     </w:p>
     <w:p>
@@ -2885,24 +2939,42 @@
       </w:r>
     </w:p>
     <w:p>
-      Menu 
-      <w:r>
-        <w:rPr>
-          <w:rFonts w:ascii="Calibri" w:cs="Calibri" w:eastAsia="Calibri" w:hAnsi="Calibri"/>
-          <w:b/>
-          <w:bCs/>
-          <w:sz w:val="22"/>
-          <w:szCs w:val="22"/>
-        </w:rPr>
-        <w:t xml:space="preserve">“Lớp học”</w:t>
-      </w:r>
-      <w:r>
-        <w:rPr>
-          <w:rFonts w:ascii="Calibri" w:cs="Calibri" w:eastAsia="Calibri" w:hAnsi="Calibri"/>
-          <w:sz w:val="22"/>
-          <w:szCs w:val="22"/>
-        </w:rPr>
-        <w:t xml:space="preserve"> → “Thêm lớp” → nhập Mã môn, Tên môn, Số tín chỉ, Học kỳ, Năm học → “Tạo lớp”.</w:t>
+      Ở mục 
+      <w:r>
+        <w:rPr>
+          <w:rFonts w:ascii="Calibri" w:cs="Calibri" w:eastAsia="Calibri" w:hAnsi="Calibri"/>
+          <w:b/>
+          <w:bCs/>
+          <w:sz w:val="22"/>
+          <w:szCs w:val="22"/>
+        </w:rPr>
+        <w:t xml:space="preserve">“Điểm danh”</w:t>
+      </w:r>
+      <w:r>
+        <w:rPr>
+          <w:rFonts w:ascii="Calibri" w:cs="Calibri" w:eastAsia="Calibri" w:hAnsi="Calibri"/>
+          <w:sz w:val="22"/>
+          <w:szCs w:val="22"/>
+        </w:rPr>
+        <w:t xml:space="preserve"> hoặc </w:t>
+      </w:r>
+      <w:r>
+        <w:rPr>
+          <w:rFonts w:ascii="Calibri" w:cs="Calibri" w:eastAsia="Calibri" w:hAnsi="Calibri"/>
+          <w:b/>
+          <w:bCs/>
+          <w:sz w:val="22"/>
+          <w:szCs w:val="22"/>
+        </w:rPr>
+        <w:t xml:space="preserve">“Nhập điểm”</w:t>
+      </w:r>
+      <w:r>
+        <w:rPr>
+          <w:rFonts w:ascii="Calibri" w:cs="Calibri" w:eastAsia="Calibri" w:hAnsi="Calibri"/>
+          <w:sz w:val="22"/>
+          <w:szCs w:val="22"/>
+        </w:rPr>
+        <w:t xml:space="preserve"> → “Thêm lớp” → nhập Mã môn, Tên môn, Số tín chỉ, Học kỳ, Năm học → “Tạo lớp”. Lớp tạo ở một mục sẽ dùng chung cho cả hai.</w:t>
       </w:r>
     </w:p>
     <w:p>
@@ -2940,11 +3012,11 @@
           <w:sz w:val="23"/>
           <w:szCs w:val="23"/>
         </w:rPr>
-        <w:t xml:space="preserve">9.2. Điểm danh</w:t>
-      </w:r>
-    </w:p>
-    <w:p>
-      Tab 
+        <w:t xml:space="preserve">9.2. Trang Điểm danh</w:t>
+      </w:r>
+    </w:p>
+    <w:p>
+      Mở mục 
       <w:r>
         <w:rPr>
           <w:rFonts w:ascii="Calibri" w:cs="Calibri" w:eastAsia="Calibri" w:hAnsi="Calibri"/>
@@ -2961,7 +3033,7 @@
           <w:sz w:val="22"/>
           <w:szCs w:val="22"/>
         </w:rPr>
-        <w:t xml:space="preserve"> → chọn Buổi ngày → tick “Có mặt” cho từng SV → “Lưu điểm danh”.</w:t>
+        <w:t xml:space="preserve"> (menu bên trái) → chọn Buổi ngày → tick “Có mặt” cho từng SV → “Lưu điểm danh”.</w:t>
       </w:r>
     </w:p>
     <w:p>
@@ -2999,11 +3071,11 @@
           <w:sz w:val="23"/>
           <w:szCs w:val="23"/>
         </w:rPr>
-        <w:t xml:space="preserve">9.3. Nhập điểm thành phần</w:t>
-      </w:r>
-    </w:p>
-    <w:p>
-      Tab 
+        <w:t xml:space="preserve">9.3. Trang Nhập điểm</w:t>
+      </w:r>
+    </w:p>
+    <w:p>
+      Mở mục 
       <w:r>
         <w:rPr>
           <w:rFonts w:ascii="Calibri" w:cs="Calibri" w:eastAsia="Calibri" w:hAnsi="Calibri"/>
@@ -3020,7 +3092,7 @@
           <w:sz w:val="22"/>
           <w:szCs w:val="22"/>
         </w:rPr>
-        <w:t xml:space="preserve">: gõ TX/GK/CK cho từng SV trong lớp → “Lưu điểm”. Tổng &amp; điểm chữ tính tự động (trọng số TX 0.2 · GK 0.3 · CK 0.5). Điểm này hiện luôn ở cổng sinh viên và tính vào rủi ro.</w:t>
+        <w:t xml:space="preserve"> (menu bên trái): gõ TX/GK/CK cho từng SV trong lớp → “Lưu điểm”. Tổng &amp; điểm chữ tính tự động (trọng số TX 0.2 · GK 0.3 · CK 0.5). Điểm này hiện luôn ở cổng sinh viên và tính vào rủi ro.</w:t>
       </w:r>
     </w:p>
     <w:p>

</xml_diff>